<commit_message>
Set default table cell margins in Word renderer
Add a W.TableCellMarginDefault to WordTableRenderer to apply consistent cell padding (Top/Bottom = 0 dxa, Start/End = 108 dxa) alongside the existing border settings. Also updates the test verification .docx that reflects the adjusted table layout.
</commit_message>
<xml_diff>
--- a/src/Excelsior.Tests/Word/WordTableBuilderTests.RendersTableFromAttributedModel.verified.docx
+++ b/src/Excelsior.Tests/Word/WordTableBuilderTests.RendersTableFromAttributedModel.verified.docx
@@ -12,6 +12,12 @@
           <w:insideH w:val="single" w:sz="4"/>
           <w:insideV w:val="single" w:sz="4"/>
         </w:tblBorders>
+        <w:tblCellMar>
+          <w:top w:w="0" w:type="dxa"/>
+          <w:start w:w="108" w:type="dxa"/>
+          <w:bottom w:w="0" w:type="dxa"/>
+          <w:end w:w="108" w:type="dxa"/>
+        </w:tblCellMar>
       </w:tblPr>
       <w:tblGrid>
         <w:gridCol/>

</xml_diff>